<commit_message>
Remove Salesforce references — it's the All Transactions fee report
The Import tab, How To Guide and SOP now call it the 'All Transactions' fee
report (Excel/CSV) with no CRM named.

Co-Authored-By: Claude Fable 5 <noreply@anthropic.com>
Claude-Session: https://claude.ai/code/session_01NJs6mi8LNhWUL2Cmf4Liqz
</commit_message>
<xml_diff>
--- a/MWS_Tax_Invoice_Generator_SOP.docx
+++ b/MWS_Tax_Invoice_Generator_SOP.docx
@@ -472,7 +472,7 @@
           <w:szCs w:val="21"/>
           <w:rFonts w:ascii="Nunito Sans" w:cs="Nunito Sans" w:eastAsia="Nunito Sans" w:hAnsi="Nunito Sans"/>
         </w:rPr>
-        <w:t xml:space="preserve">— from Salesforce (the All Transactions report can be imported directly, see Step 1).</w:t>
+        <w:t xml:space="preserve">— the All Transactions fee report can be imported directly, see Step 1.</w:t>
       </w:r>
     </w:p>
     <w:p>
@@ -559,7 +559,7 @@
           <w:szCs w:val="21"/>
           <w:rFonts w:ascii="Nunito Sans" w:cs="Nunito Sans" w:eastAsia="Nunito Sans" w:hAnsi="Nunito Sans"/>
         </w:rPr>
-        <w:t xml:space="preserve">Open the Import tab and drop in the Salesforce "All Transactions" Excel export.</w:t>
+        <w:t xml:space="preserve">Open the Import tab and drop in the "All Transactions" fee report (Excel/CSV export).</w:t>
       </w:r>
     </w:p>
     <w:p>

</xml_diff>